<commit_message>
sunday push 2_data add
</commit_message>
<xml_diff>
--- a/photo_assetts/About_Left.docx
+++ b/photo_assetts/About_Left.docx
@@ -85,31 +85,106 @@
           <w:szCs w:val="22"/>
           <w14:ligatures w14:val="none"/>
         </w:rPr>
-        <w:t xml:space="preserve">City hall meetings are important public forums, but most papers no longer have the resources to send reporters in person causing media to under-report on these vital local institutions. Even when they can send reporters, they often write up a dry, </w:t>
-      </w:r>
-      <w:proofErr w:type="gramStart"/>
-      <w:r>
-        <w:rPr>
-          <w:rFonts w:ascii="Arial" w:eastAsia="Times New Roman" w:hAnsi="Arial" w:cs="Arial"/>
-          <w:color w:val="000000"/>
-          <w:kern w:val="0"/>
-          <w:sz w:val="22"/>
-          <w:szCs w:val="22"/>
-          <w14:ligatures w14:val="none"/>
-        </w:rPr>
-        <w:t>200 word</w:t>
-      </w:r>
-      <w:proofErr w:type="gramEnd"/>
-      <w:r>
-        <w:rPr>
-          <w:rFonts w:ascii="Arial" w:eastAsia="Times New Roman" w:hAnsi="Arial" w:cs="Arial"/>
-          <w:color w:val="000000"/>
-          <w:kern w:val="0"/>
-          <w:sz w:val="22"/>
-          <w:szCs w:val="22"/>
-          <w14:ligatures w14:val="none"/>
-        </w:rPr>
-        <w:t xml:space="preserve"> summary of the meeting easily duplicated by AI. </w:t>
+        <w:t xml:space="preserve">City hall meetings are </w:t>
+      </w:r>
+      <w:r>
+        <w:rPr>
+          <w:rFonts w:ascii="Arial" w:eastAsia="Times New Roman" w:hAnsi="Arial" w:cs="Arial"/>
+          <w:color w:val="000000"/>
+          <w:kern w:val="0"/>
+          <w:sz w:val="22"/>
+          <w:szCs w:val="22"/>
+          <w14:ligatures w14:val="none"/>
+        </w:rPr>
+        <w:t>vital</w:t>
+      </w:r>
+      <w:r>
+        <w:rPr>
+          <w:rFonts w:ascii="Arial" w:eastAsia="Times New Roman" w:hAnsi="Arial" w:cs="Arial"/>
+          <w:color w:val="000000"/>
+          <w:kern w:val="0"/>
+          <w:sz w:val="22"/>
+          <w:szCs w:val="22"/>
+          <w14:ligatures w14:val="none"/>
+        </w:rPr>
+        <w:t xml:space="preserve"> public forums, but most </w:t>
+      </w:r>
+      <w:r>
+        <w:rPr>
+          <w:rFonts w:ascii="Arial" w:eastAsia="Times New Roman" w:hAnsi="Arial" w:cs="Arial"/>
+          <w:color w:val="000000"/>
+          <w:kern w:val="0"/>
+          <w:sz w:val="22"/>
+          <w:szCs w:val="22"/>
+          <w14:ligatures w14:val="none"/>
+        </w:rPr>
+        <w:t>local outlets</w:t>
+      </w:r>
+      <w:r>
+        <w:rPr>
+          <w:rFonts w:ascii="Arial" w:eastAsia="Times New Roman" w:hAnsi="Arial" w:cs="Arial"/>
+          <w:color w:val="000000"/>
+          <w:kern w:val="0"/>
+          <w:sz w:val="22"/>
+          <w:szCs w:val="22"/>
+          <w14:ligatures w14:val="none"/>
+        </w:rPr>
+        <w:t xml:space="preserve"> no longer have the resources to send reporters </w:t>
+      </w:r>
+      <w:r>
+        <w:rPr>
+          <w:rFonts w:ascii="Arial" w:eastAsia="Times New Roman" w:hAnsi="Arial" w:cs="Arial"/>
+          <w:color w:val="000000"/>
+          <w:kern w:val="0"/>
+          <w:sz w:val="22"/>
+          <w:szCs w:val="22"/>
+          <w14:ligatures w14:val="none"/>
+        </w:rPr>
+        <w:t>to these meetings.</w:t>
+      </w:r>
+      <w:r>
+        <w:rPr>
+          <w:rFonts w:ascii="Arial" w:eastAsia="Times New Roman" w:hAnsi="Arial" w:cs="Arial"/>
+          <w:color w:val="000000"/>
+          <w:kern w:val="0"/>
+          <w:sz w:val="22"/>
+          <w:szCs w:val="22"/>
+          <w14:ligatures w14:val="none"/>
+        </w:rPr>
+        <w:t xml:space="preserve"> </w:t>
+      </w:r>
+      <w:r>
+        <w:rPr>
+          <w:rFonts w:ascii="Arial" w:eastAsia="Times New Roman" w:hAnsi="Arial" w:cs="Arial"/>
+          <w:color w:val="000000"/>
+          <w:kern w:val="0"/>
+          <w:sz w:val="22"/>
+          <w:szCs w:val="22"/>
+          <w14:ligatures w14:val="none"/>
+        </w:rPr>
+        <w:t>When reporters do cover smaller city halls, they often</w:t>
+      </w:r>
+      <w:r>
+        <w:rPr>
+          <w:rFonts w:ascii="Arial" w:eastAsia="Times New Roman" w:hAnsi="Arial" w:cs="Arial"/>
+          <w:color w:val="000000"/>
+          <w:kern w:val="0"/>
+          <w:sz w:val="22"/>
+          <w:szCs w:val="22"/>
+          <w14:ligatures w14:val="none"/>
+        </w:rPr>
+        <w:t xml:space="preserve"> </w:t>
+      </w:r>
+      <w:r>
+        <w:rPr>
+          <w:rFonts w:ascii="Arial" w:eastAsia="Times New Roman" w:hAnsi="Arial" w:cs="Arial"/>
+          <w:color w:val="000000"/>
+          <w:kern w:val="0"/>
+          <w:sz w:val="22"/>
+          <w:szCs w:val="22"/>
+          <w14:ligatures w14:val="none"/>
+        </w:rPr>
+        <w:t xml:space="preserve">produce dry summaries that nobody wants to read… ignoring audience demand will not be our salvation in this attention economy. </w:t>
       </w:r>
     </w:p>
     <w:p>
@@ -165,14 +240,118 @@
       </w:pPr>
       <w:r>
         <w:rPr>
-          <w:rFonts w:ascii="Arial" w:eastAsia="Times New Roman" w:hAnsi="Arial" w:cs="Arial"/>
-          <w:color w:val="000000"/>
-          <w:kern w:val="0"/>
-          <w:sz w:val="22"/>
-          <w:szCs w:val="22"/>
-          <w14:ligatures w14:val="none"/>
-        </w:rPr>
-        <w:t xml:space="preserve">Our master’s thesis tests one possible solution to this painful paradigm and answers one question that we kept coming back to throughout our nine months at Stanford: what would it look like to make journalism </w:t>
+          <w:rFonts w:ascii="Times New Roman" w:eastAsia="Times New Roman" w:hAnsi="Times New Roman" w:cs="Times New Roman"/>
+          <w:kern w:val="0"/>
+          <w14:ligatures w14:val="none"/>
+        </w:rPr>
+        <w:t xml:space="preserve">Good journalism balances three things: accuracy, speed, and engagement. Local papers have over-indexed on the first two. As editorial resources dried up, engagement became risky. They believed, rationally and rightly, that giving their audiences more accurate information more quickly would be the best way to compete in the digital age. </w:t>
+      </w:r>
+    </w:p>
+    <w:p>
+      <w:pPr>
+        <w:spacing w:after="0" w:line="240" w:lineRule="auto"/>
+        <w:rPr>
+          <w:rFonts w:ascii="Times New Roman" w:eastAsia="Times New Roman" w:hAnsi="Times New Roman" w:cs="Times New Roman"/>
+          <w:kern w:val="0"/>
+          <w14:ligatures w14:val="none"/>
+        </w:rPr>
+      </w:pPr>
+    </w:p>
+    <w:p>
+      <w:pPr>
+        <w:spacing w:after="0" w:line="240" w:lineRule="auto"/>
+        <w:rPr>
+          <w:rFonts w:ascii="Times New Roman" w:eastAsia="Times New Roman" w:hAnsi="Times New Roman" w:cs="Times New Roman"/>
+          <w:kern w:val="0"/>
+          <w14:ligatures w14:val="none"/>
+        </w:rPr>
+      </w:pPr>
+      <w:r>
+        <w:rPr>
+          <w:rFonts w:ascii="Times New Roman" w:eastAsia="Times New Roman" w:hAnsi="Times New Roman" w:cs="Times New Roman"/>
+          <w:kern w:val="0"/>
+          <w14:ligatures w14:val="none"/>
+        </w:rPr>
+        <w:t>We have a different bet. We lean on A.I. to help us cover accuracy and speed, so that we can lean into the joy of storytelling.</w:t>
+      </w:r>
+    </w:p>
+    <w:p>
+      <w:pPr>
+        <w:spacing w:after="0" w:line="240" w:lineRule="auto"/>
+        <w:rPr>
+          <w:rFonts w:ascii="Times New Roman" w:eastAsia="Times New Roman" w:hAnsi="Times New Roman" w:cs="Times New Roman"/>
+          <w:kern w:val="0"/>
+          <w14:ligatures w14:val="none"/>
+        </w:rPr>
+      </w:pPr>
+    </w:p>
+    <w:p>
+      <w:pPr>
+        <w:spacing w:after="0" w:line="240" w:lineRule="auto"/>
+        <w:rPr>
+          <w:rFonts w:ascii="Times New Roman" w:eastAsia="Times New Roman" w:hAnsi="Times New Roman" w:cs="Times New Roman"/>
+          <w:kern w:val="0"/>
+          <w14:ligatures w14:val="none"/>
+        </w:rPr>
+      </w:pPr>
+      <w:r>
+        <w:rPr>
+          <w:rFonts w:ascii="Times New Roman" w:eastAsia="Times New Roman" w:hAnsi="Times New Roman" w:cs="Times New Roman"/>
+          <w:kern w:val="0"/>
+          <w14:ligatures w14:val="none"/>
+        </w:rPr>
+        <w:t xml:space="preserve">This project tries to answer a question we faced </w:t>
+      </w:r>
+      <w:proofErr w:type="gramStart"/>
+      <w:r>
+        <w:rPr>
+          <w:rFonts w:ascii="Times New Roman" w:eastAsia="Times New Roman" w:hAnsi="Times New Roman" w:cs="Times New Roman"/>
+          <w:kern w:val="0"/>
+          <w14:ligatures w14:val="none"/>
+        </w:rPr>
+        <w:t>over and over again</w:t>
+      </w:r>
+      <w:proofErr w:type="gramEnd"/>
+      <w:r>
+        <w:rPr>
+          <w:rFonts w:ascii="Times New Roman" w:eastAsia="Times New Roman" w:hAnsi="Times New Roman" w:cs="Times New Roman"/>
+          <w:kern w:val="0"/>
+          <w14:ligatures w14:val="none"/>
+        </w:rPr>
+        <w:t xml:space="preserve"> at Stanford: </w:t>
+      </w:r>
+      <w:r>
+        <w:rPr>
+          <w:rFonts w:ascii="Arial" w:eastAsia="Times New Roman" w:hAnsi="Arial" w:cs="Arial"/>
+          <w:color w:val="000000"/>
+          <w:kern w:val="0"/>
+          <w:sz w:val="22"/>
+          <w:szCs w:val="22"/>
+          <w14:ligatures w14:val="none"/>
+        </w:rPr>
+        <w:t xml:space="preserve">what </w:t>
+      </w:r>
+      <w:r>
+        <w:rPr>
+          <w:rFonts w:ascii="Arial" w:eastAsia="Times New Roman" w:hAnsi="Arial" w:cs="Arial"/>
+          <w:color w:val="000000"/>
+          <w:kern w:val="0"/>
+          <w:sz w:val="22"/>
+          <w:szCs w:val="22"/>
+          <w14:ligatures w14:val="none"/>
+        </w:rPr>
+        <w:t>does</w:t>
+      </w:r>
+      <w:r>
+        <w:rPr>
+          <w:rFonts w:ascii="Arial" w:eastAsia="Times New Roman" w:hAnsi="Arial" w:cs="Arial"/>
+          <w:color w:val="000000"/>
+          <w:kern w:val="0"/>
+          <w:sz w:val="22"/>
+          <w:szCs w:val="22"/>
+          <w14:ligatures w14:val="none"/>
+        </w:rPr>
+        <w:t xml:space="preserve"> it look like to make journalism </w:t>
       </w:r>
       <w:r>
         <w:rPr>
@@ -213,21 +392,96 @@
       <w:pPr>
         <w:spacing w:after="0" w:line="240" w:lineRule="auto"/>
         <w:rPr>
-          <w:rFonts w:ascii="Times New Roman" w:eastAsia="Times New Roman" w:hAnsi="Times New Roman" w:cs="Times New Roman"/>
-          <w:kern w:val="0"/>
-          <w14:ligatures w14:val="none"/>
-        </w:rPr>
-      </w:pPr>
-      <w:r>
-        <w:rPr>
-          <w:rFonts w:ascii="Arial" w:eastAsia="Times New Roman" w:hAnsi="Arial" w:cs="Arial"/>
-          <w:color w:val="000000"/>
-          <w:kern w:val="0"/>
-          <w:sz w:val="22"/>
-          <w:szCs w:val="22"/>
-          <w14:ligatures w14:val="none"/>
-        </w:rPr>
-        <w:t xml:space="preserve">To us, this means bringing journalism back to its storytelling roots. If we want people to engage with local journalism, let’s make local journalism incredibly fun to engage with. Gen-Z audiences are interested in </w:t>
+          <w:rFonts w:ascii="Arial" w:eastAsia="Times New Roman" w:hAnsi="Arial" w:cs="Arial"/>
+          <w:color w:val="000000"/>
+          <w:kern w:val="0"/>
+          <w:sz w:val="22"/>
+          <w:szCs w:val="22"/>
+          <w14:ligatures w14:val="none"/>
+        </w:rPr>
+      </w:pPr>
+      <w:r>
+        <w:rPr>
+          <w:rFonts w:ascii="Arial" w:eastAsia="Times New Roman" w:hAnsi="Arial" w:cs="Arial"/>
+          <w:color w:val="000000"/>
+          <w:kern w:val="0"/>
+          <w:sz w:val="22"/>
+          <w:szCs w:val="22"/>
+          <w14:ligatures w14:val="none"/>
+        </w:rPr>
+        <w:t>To us, this means bringing journalism back to its storytelling roots.</w:t>
+      </w:r>
+      <w:r>
+        <w:rPr>
+          <w:rFonts w:ascii="Arial" w:eastAsia="Times New Roman" w:hAnsi="Arial" w:cs="Arial"/>
+          <w:color w:val="000000"/>
+          <w:kern w:val="0"/>
+          <w:sz w:val="22"/>
+          <w:szCs w:val="22"/>
+          <w14:ligatures w14:val="none"/>
+        </w:rPr>
+        <w:t xml:space="preserve"> To the whisper networks of rebellions. To the gossip circles of women’s movements. To the town criers. </w:t>
+      </w:r>
+    </w:p>
+    <w:p>
+      <w:pPr>
+        <w:pBdr>
+          <w:bottom w:val="thinThickThinMediumGap" w:sz="18" w:space="1" w:color="auto"/>
+        </w:pBdr>
+        <w:spacing w:after="0" w:line="240" w:lineRule="auto"/>
+        <w:rPr>
+          <w:rFonts w:ascii="Arial" w:eastAsia="Times New Roman" w:hAnsi="Arial" w:cs="Arial"/>
+          <w:color w:val="000000"/>
+          <w:kern w:val="0"/>
+          <w:sz w:val="22"/>
+          <w:szCs w:val="22"/>
+          <w14:ligatures w14:val="none"/>
+        </w:rPr>
+      </w:pPr>
+    </w:p>
+    <w:p>
+      <w:pPr>
+        <w:spacing w:after="0" w:line="240" w:lineRule="auto"/>
+        <w:rPr>
+          <w:rFonts w:ascii="Arial" w:eastAsia="Times New Roman" w:hAnsi="Arial" w:cs="Arial"/>
+          <w:color w:val="000000"/>
+          <w:kern w:val="0"/>
+          <w:sz w:val="22"/>
+          <w:szCs w:val="22"/>
+          <w14:ligatures w14:val="none"/>
+        </w:rPr>
+      </w:pPr>
+    </w:p>
+    <w:p>
+      <w:pPr>
+        <w:spacing w:after="0" w:line="240" w:lineRule="auto"/>
+        <w:rPr>
+          <w:rFonts w:ascii="Times New Roman" w:eastAsia="Times New Roman" w:hAnsi="Times New Roman" w:cs="Times New Roman"/>
+          <w:kern w:val="0"/>
+          <w14:ligatures w14:val="none"/>
+        </w:rPr>
+      </w:pPr>
+      <w:r>
+        <w:rPr>
+          <w:rFonts w:ascii="Arial" w:eastAsia="Times New Roman" w:hAnsi="Arial" w:cs="Arial"/>
+          <w:color w:val="000000"/>
+          <w:kern w:val="0"/>
+          <w:sz w:val="22"/>
+          <w:szCs w:val="22"/>
+          <w14:ligatures w14:val="none"/>
+        </w:rPr>
+        <w:t xml:space="preserve">I don’t just want straight information. </w:t>
+      </w:r>
+      <w:r>
+        <w:rPr>
+          <w:rFonts w:ascii="Arial" w:eastAsia="Times New Roman" w:hAnsi="Arial" w:cs="Arial"/>
+          <w:color w:val="000000"/>
+          <w:kern w:val="0"/>
+          <w:sz w:val="22"/>
+          <w:szCs w:val="22"/>
+          <w14:ligatures w14:val="none"/>
+        </w:rPr>
+        <w:t xml:space="preserve">If we want people to engage with local journalism, let’s make local journalism incredibly fun to engage with. Gen-Z audiences are interested in </w:t>
       </w:r>
       <w:hyperlink r:id="rId4" w:history="1">
         <w:r>

</xml_diff>